<commit_message>
docs: define post-install transfer registry
</commit_message>
<xml_diff>
--- a/docs/specifications/First_Gear_Bank_v1_Codex_Specification_ver_03.docx
+++ b/docs/specifications/First_Gear_Bank_v1_Codex_Specification_ver_03.docx
@@ -570,10 +570,7 @@
         <w:t>fixed</w:t>
       </w:r>
       <w:r>
-        <w:t xml:space="preserve"> </w:t>
-      </w:r>
-      <w:r>
-        <w:t>are normative. Text explicitly labeled as an implementation note may guide structure without prescribing a class name. Concrete Vintage Story types, hooks, asset codes, and third-party integration identifiers must be verified against the installed 1.22.7 reference project before coding; that verification gate does not weaken the required behavior.</w:t>
+        <w:t xml:space="preserve"> are normative. Text explicitly labeled as an implementation note may guide structure without prescribing a class name. Concrete Vintage Story types, hooks, asset codes, and third-party integration identifiers must be verified against the installed 1.22.7 reference project before coding; that verification gate does not weaken the required behavior.</w:t>
       </w:r>
     </w:p>
     <w:p>
@@ -648,7 +645,7 @@
         </w:numPr>
       </w:pPr>
       <w:r>
-        <w:t>direct rusty-savings transfers between known players.</w:t>
+        <w:t>direct rusty-savings transfers to players successfully registered through observation in the current per-world recipient-registry epoch.</w:t>
       </w:r>
     </w:p>
     <w:p>
@@ -790,6 +787,7 @@
     </w:p>
     <w:p>
       <w:r>
+        <w:lastRenderedPageBreak/>
         <w:t>The general ledger uses signed accounts so future liabilities can be introduced cleanly. That extensibility must not enable a negative savings or temporal-vault balance in v1.</w:t>
       </w:r>
     </w:p>
@@ -801,7 +799,6 @@
       <w:bookmarkEnd w:id="1"/>
       <w:bookmarkEnd w:id="2"/>
       <w:r>
-        <w:lastRenderedPageBreak/>
         <w:t>Architectural Model</w:t>
       </w:r>
     </w:p>
@@ -855,8 +852,6 @@
       </w:r>
       <w:r>
         <w:br/>
-      </w:r>
-      <w:r>
         <w:t>`-- Vintage Story 1.22.7 adapter</w:t>
       </w:r>
       <w:r>
@@ -956,17 +951,12 @@
       </w:r>
       <w:r>
         <w:br/>
-      </w:r>
-      <w:r>
         <w:t>`-- BranchAccessService</w:t>
       </w:r>
     </w:p>
     <w:p>
       <w:r>
-        <w:t>The coordinator captures one authoritative timestamp, serializes financial mutations, validates a complete candidate result, and publishes one immutable revision. A revision may contain zero or more ordered, individually balanced journal records plus all matching projection, deduplication, settlement, and notification-outbox changes. A zero-record revision is allowed only for durable nonfinancial control state such as finalizing a rejected authenticated request. The entire batch commits all-or-nothing befor</w:t>
-      </w:r>
-      <w:r>
-        <w:t>e a terminal result is reported.</w:t>
+        <w:t>The coordinator captures one authoritative timestamp, serializes financial mutations, validates a complete candidate result, and publishes one immutable revision. A revision may contain zero or more ordered, individually balanced journal records plus all matching projection, deduplication, settlement, and notification-outbox changes. A zero-record revision is allowed only for durable nonfinancial control state such as finalizing a rejected authenticated request. The entire batch commits all-or-nothing before a terminal result is reported.</w:t>
       </w:r>
     </w:p>
     <w:p>
@@ -1109,10 +1099,7 @@
         <w:pStyle w:val="BodyText"/>
       </w:pPr>
       <w:r>
-        <w:t xml:space="preserve">Automatically generated interest saturates the affected cash balance at the ceiling without first constructing an overflowing exponential or posting hypothetical above-cap interest. The resulting accrual record carries nonmonetary WasCapped audit metadata; value beyond the hard cutoff is not created, left pending, or retried. Once at the ceiling, an account receives no additional credited interest until its balance falls. An already-contracted finite CD payoff uses the separate representable CapOverflow </w:t>
-      </w:r>
-      <w:r>
-        <w:t>settlement rule in section 12.5. This deliberately treats the ceiling as the user-requested cutoff rather than as a new economic instrument.</w:t>
+        <w:t>Automatically generated interest saturates the affected cash balance at the ceiling without first constructing an overflowing exponential or posting hypothetical above-cap interest. The resulting accrual record carries nonmonetary WasCapped audit metadata; value beyond the hard cutoff is not created, left pending, or retried. Once at the ceiling, an account receives no additional credited interest until its balance falls. An already-contracted finite CD payoff uses the separate representable CapOverflow settlement rule in section 12.5. This deliberately treats the ceiling as the user-requested cutoff rather than as a new economic instrument.</w:t>
       </w:r>
     </w:p>
     <w:p>
@@ -1136,10 +1123,7 @@
     </w:p>
     <w:p>
       <w:r>
-        <w:t xml:space="preserve">One personal banking relationship exists per authoritative Vintage Story PlayerUID </w:t>
-      </w:r>
-      <w:r>
-        <w:t>per world.</w:t>
+        <w:t>One personal banking relationship exists per authoritative Vintage Story PlayerUID per world.</w:t>
       </w:r>
     </w:p>
     <w:p>
@@ -1308,8 +1292,6 @@
       </w:r>
       <w:r>
         <w:br/>
-      </w:r>
-      <w:r>
         <w:t>+-- Sequence                 // contiguous world sequence</w:t>
       </w:r>
       <w:r>
@@ -1358,8 +1340,6 @@
       </w:r>
       <w:r>
         <w:br/>
-      </w:r>
-      <w:r>
         <w:t>`-- Postings[]</w:t>
       </w:r>
       <w:r>
@@ -1678,10 +1658,7 @@
           </w:tcPr>
           <w:p>
             <w:r>
-              <w:t>CD liability +P</w:t>
-            </w:r>
-            <w:r>
-              <w:t>; CD-interest expense +(M-P)</w:t>
+              <w:t>CD liability +P; CD-interest expense +(M-P)</w:t>
             </w:r>
           </w:p>
         </w:tc>
@@ -1780,10 +1757,7 @@
         <w:pStyle w:val="BodyText"/>
       </w:pPr>
       <w:r>
-        <w:t>One coordinator commit may contain multiple ordered JournalRecord</w:t>
-      </w:r>
-      <w:r>
-        <w:t>s when chronological catch-up crosses months or maturities before the requested business operation. Every record has one transaction type and balances independently per currency; every record in the batch shares a correlation CommandId, and the whole batch publishes or fails together. One transfer itself is exactly one journal record. TransferOut and TransferIn are directional statement views, not separately committable records.</w:t>
+        <w:t>One coordinator commit may contain multiple ordered JournalRecords when chronological catch-up crosses months or maturities before the requested business operation. Every record has one transaction type and balances independently per currency; every record in the batch shares a correlation CommandId, and the whole batch publishes or fails together. One transfer itself is exactly one journal record. TransferOut and TransferIn are directional statement views, not separately committable records.</w:t>
       </w:r>
     </w:p>
     <w:p>
@@ -1797,10 +1771,7 @@
     </w:p>
     <w:p>
       <w:r>
-        <w:t xml:space="preserve">Every client mutation uses a RequestKey </w:t>
-      </w:r>
-      <w:r>
-        <w:t>containing the authenticated PlayerUID, a server-issued nonreused operation-scope nonce, and a strictly increasing mutation sequence. A scope accepts one mutation at a time and only its next sequence. The same immutable coordinator revision that finalizes a request advances the persisted high-water mark and records its payload digest, terminal result, operation IDs, and resulting revision. Closed or pre-restart scopes are permanently invalid.</w:t>
+        <w:t>Every client mutation uses a RequestKey containing the authenticated PlayerUID, a server-issued nonreused operation-scope nonce, and a strictly increasing mutation sequence. A scope accepts one mutation at a time and only its next sequence. The same immutable coordinator revision that finalizes a request advances the persisted high-water mark and records its payload digest, terminal result, operation IDs, and resulting revision. Closed or pre-restart scopes are permanently invalid.</w:t>
       </w:r>
     </w:p>
     <w:p>
@@ -1808,10 +1779,7 @@
         <w:pStyle w:val="BodyText"/>
       </w:pPr>
       <w:r>
-        <w:t>An identical retry whose response remains cached returns that response. Reuse with a different payload is rejected. A sequence at or below the high-water mark after its response body has been pruned returns AlreadyProcessedResponseExpired and is never executed again. Successful financial records permanently retain their RequestKey</w:t>
-      </w:r>
-      <w:r>
-        <w:t>; physical settlements retain it in their settlement tombstone. Full response bodies may be bounded. Active scopes retain their high-water state; a closed or pre-restart nonce is invalid because it is absent from the active-scope registry, not because every closed scope is retained forever. Exact committed request keys and settlement tombstones remain permanent replay barriers. Automatic operations use deterministic keys such as CdMaturity:&lt;CdId&gt;.</w:t>
+        <w:t>An identical retry whose response remains cached returns that response. Reuse with a different payload is rejected. A sequence at or below the high-water mark after its response body has been pruned returns AlreadyProcessedResponseExpired and is never executed again. Successful financial records permanently retain their RequestKey; physical settlements retain it in their settlement tombstone. Full response bodies may be bounded. Active scopes retain their high-water state; a closed or pre-restart nonce is invalid because it is absent from the active-scope registry, not because every closed scope is retained forever. Exact committed request keys and settlement tombstones remain permanent replay barriers. Automatic operations use deterministic keys such as CdMaturity:&lt;CdId&gt;.</w:t>
       </w:r>
     </w:p>
     <w:p>
@@ -1914,10 +1882,7 @@
         <w:pStyle w:val="BodyText"/>
       </w:pPr>
       <w:r>
-        <w:t xml:space="preserve">One financial year is exactly twelve Vintage Story calendar months. A contract for T financial months remains T months when daysPerMonth </w:t>
-      </w:r>
-      <w:r>
-        <w:t>changes. Never hardcode a 30-, 360-, or 365-day financial period. Contractual issue and maturity instants are stored on the monotonic financial clock; a world-calendar date is only a basis-appropriate rendering of that financial instant.</w:t>
+        <w:t>One financial year is exactly twelve Vintage Story calendar months. A contract for T financial months remains T months when daysPerMonth changes. Never hardcode a 30-, 360-, or 365-day financial period. Contractual issue and maturity instants are stored on the monotonic financial clock; a world-calendar date is only a basis-appropriate rendering of that financial instant.</w:t>
       </w:r>
     </w:p>
     <w:p>
@@ -2235,10 +2200,7 @@
     </w:p>
     <w:p>
       <w:r>
-        <w:t xml:space="preserve">Let q </w:t>
-      </w:r>
-      <w:r>
-        <w:t>be that configured value. The internal continuously compounded annual long-run mean is:</w:t>
+        <w:t>Let q be that configured value. The internal continuously compounded annual long-run mean is:</w:t>
       </w:r>
     </w:p>
     <w:p>
@@ -2689,13 +2651,7 @@
             <w:rPr>
               <w:rFonts w:ascii="Cambria Math" w:hAnsi="Cambria Math"/>
             </w:rPr>
-            <m:t> </m:t>
-          </m:r>
-          <m:r>
-            <w:rPr>
-              <w:rFonts w:ascii="Cambria Math" w:hAnsi="Cambria Math"/>
-            </w:rPr>
-            <m:t>d</m:t>
+            <m:t> d</m:t>
           </m:r>
           <m:sSub>
             <m:sSubPr>
@@ -2971,10 +2927,7 @@
         <w:pStyle w:val="BodyText"/>
       </w:pPr>
       <w:r>
-        <w:t xml:space="preserve">For a CIR-to-CIR parameter or target change, derive the new theta but preserve the closing realized r </w:t>
-      </w:r>
-      <w:r>
-        <w:t>as the next transition input. CIR then mean-reverts toward the new target; a target change does not reroll or reset the closing rate.</w:t>
+        <w:t>For a CIR-to-CIR parameter or target change, derive the new theta but preserve the closing realized r as the next transition input. CIR then mean-reverts toward the new target; a target change does not reroll or reset the closing rate.</w:t>
       </w:r>
     </w:p>
     <w:p>
@@ -3125,10 +3078,7 @@
           </w:tcPr>
           <w:p>
             <w:r>
-              <w:t xml:space="preserve">Preserve the closing constant r </w:t>
-            </w:r>
-            <w:r>
-              <w:t>as input; draw one exact transition using the activated CIR parameters</w:t>
+              <w:t>Preserve the closing constant r as input; draw one exact transition using the activated CIR parameters</w:t>
             </w:r>
           </w:p>
         </w:tc>
@@ -3224,10 +3174,7 @@
     </w:p>
     <w:p>
       <w:r>
-        <w:t xml:space="preserve">CIR transitions once per financial month with Delta = 1/12 year. For kappa &gt; 0 and </w:t>
-      </w:r>
-      <w:r>
-        <w:t>sigma &gt; 0:</w:t>
+        <w:t>CIR transitions once per financial month with Delta = 1/12 year. For kappa &gt; 0 and sigma &gt; 0:</w:t>
       </w:r>
     </w:p>
     <w:p>
@@ -3310,13 +3257,7 @@
             <w:rPr>
               <w:rFonts w:ascii="Cambria Math" w:hAnsi="Cambria Math"/>
             </w:rPr>
-            <m:t>  </m:t>
-          </m:r>
-          <m:r>
-            <w:rPr>
-              <w:rFonts w:ascii="Cambria Math" w:hAnsi="Cambria Math"/>
-            </w:rPr>
-            <m:t>c</m:t>
+            <m:t>  c</m:t>
           </m:r>
           <m:r>
             <m:rPr>
@@ -3406,13 +3347,7 @@
                 <w:rPr>
                   <w:rFonts w:ascii="Cambria Math" w:hAnsi="Cambria Math"/>
                 </w:rPr>
-                <m:t>4</m:t>
-              </m:r>
-              <m:r>
-                <w:rPr>
-                  <w:rFonts w:ascii="Cambria Math" w:hAnsi="Cambria Math"/>
-                </w:rPr>
-                <m:t>κ</m:t>
+                <m:t>4κ</m:t>
               </m:r>
             </m:den>
           </m:f>
@@ -3453,13 +3388,7 @@
                 <w:rPr>
                   <w:rFonts w:ascii="Cambria Math" w:hAnsi="Cambria Math"/>
                 </w:rPr>
-                <m:t>4</m:t>
-              </m:r>
-              <m:r>
-                <w:rPr>
-                  <w:rFonts w:ascii="Cambria Math" w:hAnsi="Cambria Math"/>
-                </w:rPr>
-                <m:t>κθ</m:t>
+                <m:t>4κθ</m:t>
               </m:r>
             </m:num>
             <m:den>
@@ -3503,13 +3432,7 @@
             <w:rPr>
               <w:rFonts w:ascii="Cambria Math" w:hAnsi="Cambria Math"/>
             </w:rPr>
-            <m:t>  </m:t>
-          </m:r>
-          <m:r>
-            <w:rPr>
-              <w:rFonts w:ascii="Cambria Math" w:hAnsi="Cambria Math"/>
-            </w:rPr>
-            <m:t>λ</m:t>
+            <m:t>  λ</m:t>
           </m:r>
           <m:r>
             <m:rPr>
@@ -3533,13 +3456,7 @@
                 <w:rPr>
                   <w:rFonts w:ascii="Cambria Math" w:hAnsi="Cambria Math"/>
                 </w:rPr>
-                <m:t>4</m:t>
-              </m:r>
-              <m:r>
-                <w:rPr>
-                  <w:rFonts w:ascii="Cambria Math" w:hAnsi="Cambria Math"/>
-                </w:rPr>
-                <m:t>κe</m:t>
+                <m:t>4κe</m:t>
               </m:r>
               <m:sSub>
                 <m:sSubPr>
@@ -3833,10 +3750,7 @@
     </w:p>
     <w:p>
       <w:r>
-        <w:t xml:space="preserve">Do not use Euler simulation followed by a clamp. The mathematical transition keeps rates nonnegative. CIR mode requires finite kappa &gt; 0 and finite sigma &gt; 0; administrators wanting deterministic rates use Constant </w:t>
-      </w:r>
-      <w:r>
-        <w:t>mode. The Feller condition is not required because the exact transition supports a reachable zero boundary.</w:t>
+        <w:t>Do not use Euler simulation followed by a clamp. The mathematical transition keeps rates nonnegative. CIR mode requires finite kappa &gt; 0 and finite sigma &gt; 0; administrators wanting deterministic rates use Constant mode. The Feller condition is not required because the exact transition supports a reachable zero boundary.</w:t>
       </w:r>
     </w:p>
     <w:p>
@@ -3965,10 +3879,7 @@
     </w:p>
     <w:p>
       <w:r>
-        <w:t>For a full month the factor is exp(r/12). At r = ln(4)</w:t>
-      </w:r>
-      <w:r>
-        <w:t>, the unrounded mathematical factors are two after six months and four after twelve.</w:t>
+        <w:t>For a full month the factor is exp(r/12). At r = ln(4), the unrounded mathematical factors are two after six months and four after twelve.</w:t>
       </w:r>
     </w:p>
     <w:p>
@@ -4120,10 +4031,7 @@
         <w:pStyle w:val="BodyText"/>
       </w:pPr>
       <w:r>
-        <w:t>Its posted endpoint is CappedCompoundUnits(B_units, r * DeltaTau)</w:t>
-      </w:r>
-      <w:r>
-        <w:t>. If it saturates, credit only the amount from the opening balance to the ceiling, attach WasCapped, and create no value for the discarded mathematical excess.</w:t>
+        <w:t>Its posted endpoint is CappedCompoundUnits(B_units, r * DeltaTau). If it saturates, credit only the amount from the opening balance to the ceiling, attach WasCapped, and create no value for the discarded mathematical excess.</w:t>
       </w:r>
     </w:p>
     <w:p>
@@ -4375,8 +4283,6 @@
       </w:r>
       <w:r>
         <w:br/>
-      </w:r>
-      <w:r>
         <w:t>postedNetUnits   = CappedCompoundUnits(B_units, (r - theta) * DeltaTau)</w:t>
       </w:r>
       <w:r>
@@ -4393,10 +4299,7 @@
     </w:p>
     <w:p>
       <w:r>
-        <w:t>Gross interest, storage, the customer net change, and cap metadata commit in one atomic balanced accrual batch. postedGrossUnits is never installed as an intermediate customer balance. The resulting customer balance is postedNetUnits</w:t>
-      </w:r>
-      <w:r>
-        <w:t>; gross-interest and storage aggregates report representable posted amounts, not hypothetical amounts above the hard cutoff. A WasCapped flag records saturation. No above-cap hypothetical accrual is created or retried, while later negative temporal growth may move a capped account below the ceiling.</w:t>
+        <w:t>Gross interest, storage, the customer net change, and cap metadata commit in one atomic balanced accrual batch. postedGrossUnits is never installed as an intermediate customer balance. The resulting customer balance is postedNetUnits; gross-interest and storage aggregates report representable posted amounts, not hypothetical amounts above the hard cutoff. A WasCapped flag records saturation. No above-cap hypothetical accrual is created or retried, while later negative temporal growth may move a capped account below the ceiling.</w:t>
       </w:r>
     </w:p>
     <w:p>
@@ -4404,10 +4307,7 @@
         <w:pStyle w:val="BodyText"/>
       </w:pPr>
       <w:r>
-        <w:t>Below the balance ceiling, Constant mode is exactly flat at each posting because r = theta</w:t>
-      </w:r>
-      <w:r>
-        <w:t>: gross interest is visible and exactly offset by storage. An already capped balance posts neither new gross interest nor storage until it can move below the ceiling. Under stationary CIR, expected long-run log growth is approximately zero because E[r] = theta, while the path remains stochastic. This is not literal Brownian motion and it is not necessarily an arithmetic martingale.</w:t>
+        <w:t>Below the balance ceiling, Constant mode is exactly flat at each posting because r = theta: gross interest is visible and exactly offset by storage. An already capped balance posts neither new gross interest nor storage until it can move below the ceiling. Under stationary CIR, expected long-run log growth is approximately zero because E[r] = theta, while the path remains stochastic. This is not literal Brownian motion and it is not necessarily an arithmetic martingale.</w:t>
       </w:r>
     </w:p>
     <w:p>
@@ -4820,10 +4720,7 @@
         <w:pStyle w:val="BodyText"/>
       </w:pPr>
       <w:r>
-        <w:t>The server revalidates under inventory lock, creates the prepared record, stages the exact inventory mutation, builds the matching Bank batch, and publishes success only after the in-memory inventory and Bank revision agree. An exception before publication restores the staged runtime inventory. Startup/login reconciliation resumes a known phase exactly once when authenticated settlement evidence proves which side applied; a pending withdrawal delivery waits without a second debit if capacity is no longer av</w:t>
-      </w:r>
-      <w:r>
-        <w:t>ailable. Contradictory, tampered, or merely inferred evidence quarantines the affected settlement before further banking access. Never guess from fungible stack totals or silently compensate.</w:t>
+        <w:t>The server revalidates under inventory lock, creates the prepared record, stages the exact inventory mutation, builds the matching Bank batch, and publishes success only after the in-memory inventory and Bank revision agree. An exception before publication restores the staged runtime inventory. Startup/login reconciliation resumes a known phase exactly once when authenticated settlement evidence proves which side applied; a pending withdrawal delivery waits without a second debit if capacity is no longer available. Contradictory, tampered, or merely inferred evidence quarantines the affected settlement before further banking access. Never guess from fungible stack totals or silently compensate.</w:t>
       </w:r>
     </w:p>
     <w:p>
@@ -5003,10 +4900,7 @@
         <w:pStyle w:val="BodyText"/>
       </w:pPr>
       <w:r>
-        <w:t>Vintage Story 1.22.7 does not expose a single durable disk transaction spanning player inventory and the mod world-data blob. During implementation, inspect and crash-test whether a private recovery capsule can be co-serialized with that player’s inventory. Such a capsule must carry authenticated immutable canonical data sufficient to reconstruct either side—not only a SettlementId</w:t>
-      </w:r>
-      <w:r>
-        <w:t>. If that mechanism is proven, use it to finish one-sided saves deterministically. If it is not proven, v1’s all-or-nothing promise applies to live completed operations and the Bank ledger, while an arbitrary process/power failure inside the cross-blob save window may require settlement quarantine and audited administrator resolution. The mod must state this limitation honestly rather than claim impossible disk atomicity.</w:t>
+        <w:t>Vintage Story 1.22.7 does not expose a single durable disk transaction spanning player inventory and the mod world-data blob. During implementation, inspect and crash-test whether a private recovery capsule can be co-serialized with that player’s inventory. Such a capsule must carry authenticated immutable canonical data sufficient to reconstruct either side—not only a SettlementId. If that mechanism is proven, use it to finish one-sided saves deterministically. If it is not proven, v1’s all-or-nothing promise applies to live completed operations and the Bank ledger, while an arbitrary process/power failure inside the cross-blob save window may require settlement quarantine and audited administrator resolution. The mod must state this limitation honestly rather than claim impossible disk atomicity.</w:t>
       </w:r>
     </w:p>
     <w:p>
@@ -5014,10 +4908,7 @@
         <w:pStyle w:val="BodyText"/>
       </w:pPr>
       <w:r>
-        <w:t>Provide a permission-gated settlement-resolution command for a quarantined record. It requires the exact SettlementId, a mandatory reason, and one explicit finding: InventoryApplied or InventoryNotApplied</w:t>
-      </w:r>
-      <w:r>
-        <w:t>. From that finding and the immutable manifest, the coordinator completes or compensates the missing side in one new audited revision; it never edits old journal records. Audit administrator identity, player name/hidden key, manifests and fingerprints, selected finding, resulting operation IDs, timestamps, and reason. Ambiguous evidence is a human administrative decision, not an automatic heuristic.</w:t>
+        <w:t>Provide a permission-gated settlement-resolution command for a quarantined record. It requires the exact SettlementId, a mandatory reason, and one explicit finding: InventoryApplied or InventoryNotApplied. From that finding and the immutable manifest, the coordinator completes or compensates the missing side in one new audited revision; it never edits old journal records. Audit administrator identity, player name/hidden key, manifests and fingerprints, selected finding, resulting operation IDs, timestamps, and reason. Ambiguous evidence is a human administrative decision, not an automatic heuristic.</w:t>
       </w:r>
     </w:p>
     <w:p>
@@ -5041,7 +4932,7 @@
         <w:pStyle w:val="BodyText"/>
       </w:pPr>
       <w:r>
-        <w:t>The sender must be in a valid conversation with a Banker. The recipient may be offline and need never have used the Bank, but must be a player previously seen in the world. A successful incoming transfer lazily creates the recipient’s account.</w:t>
+        <w:t>The sender must be in a valid conversation with a Banker. The recipient may be offline and need never have used the Bank, but First Gear Bank must have committed that player’s observation in the current RegistryEpochId for this world. The normal initial epoch begins when the mod is installed. A successful incoming transfer lazily creates the recipient’s account.</w:t>
       </w:r>
     </w:p>
     <w:p>
@@ -5063,7 +4954,7 @@
     </w:p>
     <w:p>
       <w:r>
-        <w:t>The server maintains a persisted registry from hidden PlayerUID to the latest authenticated canonical player name.</w:t>
+        <w:t>The server maintains a persisted, per-world registry from hidden PlayerUID to the latest authenticated canonical player name. The registry is initialized empty with a new opaque RegistryEpochId when First Gear Bank state is first created for that world. This epoch remains fixed across ordinary upgrades, shutdowns, and temporary removal/reinstallation of the mod so long as its world data is retained.</w:t>
       </w:r>
     </w:p>
     <w:p>
@@ -5071,20 +4962,7 @@
         <w:pStyle w:val="BodyText"/>
       </w:pPr>
       <w:r>
-        <w:t xml:space="preserve">Before recipient resolution is enabled on first installation or migration, bootstrap this registry idempotently from authoritative </w:t>
-      </w:r>
-      <w:r>
-        <w:rPr>
-          <w:b/>
-          <w:bCs/>
-        </w:rPr>
-        <w:t>world-specific</w:t>
-      </w:r>
-      <w:r>
-        <w:t xml:space="preserve"> </w:t>
-      </w:r>
-      <w:r>
-        <w:t>saved-player membership, including offline players seen before First Gear Bank was installed; this does not create Bank accounts. Thereafter update the registry whenever a player authenticates in this world or the engine supplies a changed canonical name. Missing current metadata never deletes an already known identity.</w:t>
+        <w:t>Observation occurs only when, while First Gear Bank is active for this world, the server reports an authenticated player joining or the mod enumerates players who are currently connected and authenticated during startup. Registering a player does not create a Bank account. A player who visited before the current epoch but has not joined during it is ineligible and absent from KnownPlayerListing; that player becomes eligible after a later authenticated join only when the registry is healthy and the observation commit succeeds. There is deliberately no historical backfill.</w:t>
       </w:r>
     </w:p>
     <w:p>
@@ -5092,10 +4970,7 @@
         <w:pStyle w:val="BodyText"/>
       </w:pPr>
       <w:r>
-        <w:t xml:space="preserve">Source inspection must verify a supported world-specific enumeration route. Vintage Story 1.22.7 IPlayerDataManager.PlayerDataByUid </w:t>
-      </w:r>
-      <w:r>
-        <w:t>is documented as world-independent server data and is not sufficient proof that a player visited this save. If no supported world-specific route exists, implementation of the locked “previously seen in this world” rule is blocked pending an explicit product choice; do not silently substitute the server-wide superset or redefine it as “seen after this mod was installed.”</w:t>
+        <w:t>An observation becomes effective only when its insert or canonical-name update commits through the coordinator in an atomic zero-journal-record state revision. The persisted RecipientRegistryRevision increments on each effective insert or rename, and the touched entry's MappingVersion becomes that revision; observing an unchanged UID/name pair is an idempotent no-op. On rename, append the displaced canonical name to that UID's audit-only history in the same revision. The history survives restart and verified recovery, but its names never resolve or appear in KnownPlayerListing. Missing current metadata never deletes an already known identity. Never seed or repair this registry from IPlayerDataManager.PlayerDataByUid, another server-wide known-player collection, or data belonging to another world. If the registry cannot be loaded safely, apply the isolated recipient-registry quarantine in section 21.1 rather than broadening eligibility silently.</w:t>
       </w:r>
     </w:p>
     <w:p>
@@ -5161,10 +5036,7 @@
     </w:p>
     <w:p>
       <w:r>
-        <w:t xml:space="preserve">KnownPlayerListing </w:t>
-      </w:r>
-      <w:r>
-        <w:t>exposes only current canonical names. It must not disclose UIDs, balances, account existence, or online state.</w:t>
+        <w:t>KnownPlayerListing omits ambiguous current names and never exposes UIDs, balances, account existence, or online state.</w:t>
       </w:r>
     </w:p>
     <w:p>
@@ -5179,10 +5051,7 @@
     </w:p>
     <w:p>
       <w:r>
-        <w:t xml:space="preserve">Use a two-step server-authoritative confirmation. Resolution returns an opaque short-lived token bound internally to the sender session, recipient UID, registry revision/name, and amount intent. The confirmation screen shows the resolved canonical name and either a fixed amount or the explicit AllAtCommit </w:t>
-      </w:r>
-      <w:r>
-        <w:t>rule. A rename or ambiguous remap before commit invalidates the token and requires reconfirmation.</w:t>
+        <w:t>Use a two-step server-authoritative confirmation. Resolution returns an opaque short-lived token bound internally to the sender session, RegistryEpochId, recipient UID, recipient MappingVersion, canonical name, and amount intent. At commit, the epoch, selected entry version, and canonical name must still match, and a fresh case-insensitive resolution of that name must return exactly the same UID. An unrelated player’s insert or rename does not invalidate the token; a selected-recipient rename or newly introduced name collision does. The confirmation screen shows the resolved canonical name and either a fixed amount or the explicit AllAtCommit rule. An invalidated token requires fresh resolution and confirmation.</w:t>
       </w:r>
     </w:p>
     <w:p>
@@ -5190,10 +5059,7 @@
         <w:pStyle w:val="BodyText"/>
       </w:pPr>
       <w:r>
-        <w:t xml:space="preserve">A manually entered amount may use at most the configured rusty display precision, default three decimals. Excess decimals are rejected, not silently rounded. Transfer intent is either ExactAmount or AllAtCommit. For AllAtCommit, the token binds the mode rather than a numeric amount; confirmation says “entire balance; exact amount determined at commit” </w:t>
-      </w:r>
-      <w:r>
-        <w:t>and may show the current balance only as an estimate. Inside the serialized commit, accrue both accounts to one timestamp and transfer the sender’s exact six-decimal rusty balance, leaving it exactly zero. A recipient-cap or other failure rejects the whole transfer and never falls back to a partial amount.</w:t>
+        <w:t>A manually entered amount may use at most the configured rusty display precision, default three decimals. Excess decimals are rejected, not silently rounded. Transfer intent is either ExactAmount or AllAtCommit. For AllAtCommit, the token binds the mode rather than a numeric amount; confirmation says “entire balance; exact amount determined at commit” and may show the current balance only as an estimate. Inside the serialized commit, accrue both accounts to one timestamp and transfer the sender’s exact six-decimal rusty balance, leaving it exactly zero. A recipient-cap or other failure rejects the whole transfer and never falls back to a partial amount.</w:t>
       </w:r>
     </w:p>
     <w:p>
@@ -5319,10 +5185,7 @@
         <w:pStyle w:val="BodyText"/>
       </w:pPr>
       <w:r>
-        <w:t>Retain an outbox entry until acknowledgment and retry after disconnect or restart. Packets carry NoticeId</w:t>
-      </w:r>
-      <w:r>
-        <w:t>; the client suppresses IDs in its bounded persisted display-dedup set, and the server advances a recipient delivery watermark only after acknowledgment. Exactly-once creation and aggregation of intents is required. End-to-end visible delivery is honestly at-least-once with stable-ID duplicate suppression because a client may crash after rendering but before acknowledgment. Notification failure never reverses money.</w:t>
+        <w:t>Retain an outbox entry until acknowledgment and retry after disconnect or restart. Packets carry NoticeId; the client suppresses IDs in its bounded persisted display-dedup set, and the server advances a recipient delivery watermark only after acknowledgment. Exactly-once creation and aggregation of intents is required. End-to-end visible delivery is honestly at-least-once with stable-ID duplicate suppression because a client may crash after rendering but before acknowledgment. Notification failure never reverses money.</w:t>
       </w:r>
     </w:p>
     <w:p>
@@ -5784,13 +5647,7 @@
             <w:rPr>
               <w:rFonts w:ascii="Cambria Math" w:hAnsi="Cambria Math"/>
             </w:rPr>
-            <m:t>2</m:t>
-          </m:r>
-          <m:r>
-            <w:rPr>
-              <w:rFonts w:ascii="Cambria Math" w:hAnsi="Cambria Math"/>
-            </w:rPr>
-            <m:t>γ</m:t>
+            <m:t>2γ</m:t>
           </m:r>
         </m:oMath>
       </m:oMathPara>
@@ -6010,13 +5867,7 @@
                         <w:rPr>
                           <w:rFonts w:ascii="Cambria Math" w:hAnsi="Cambria Math"/>
                         </w:rPr>
-                        <m:t>2</m:t>
-                      </m:r>
-                      <m:r>
-                        <w:rPr>
-                          <w:rFonts w:ascii="Cambria Math" w:hAnsi="Cambria Math"/>
-                        </w:rPr>
-                        <m:t>γ</m:t>
+                        <m:t>2γ</m:t>
                       </m:r>
                       <m:sSup>
                         <m:sSupPr>
@@ -6139,13 +5990,7 @@
                 <w:rPr>
                   <w:rFonts w:ascii="Cambria Math" w:hAnsi="Cambria Math"/>
                 </w:rPr>
-                <m:t>2</m:t>
-              </m:r>
-              <m:r>
-                <w:rPr>
-                  <w:rFonts w:ascii="Cambria Math" w:hAnsi="Cambria Math"/>
-                </w:rPr>
-                <m:t>κθ</m:t>
+                <m:t>2κθ</m:t>
               </m:r>
               <m:r>
                 <m:rPr>
@@ -6516,10 +6361,7 @@
     </w:p>
     <w:p>
       <w:r>
-        <w:t xml:space="preserve">At tau = 0, define </w:t>
-      </w:r>
-      <w:r>
-        <w:t>P = 1 without evaluating the quotient. Implement A in log space and use stable expm1-style calculations where available. Constant mode uses P = exp(-r tau) and y_rf = r for all maturities. CIR configuration requires sigma &gt; 0, so the CIR curve never evaluates its singular zero-volatility form.</w:t>
+        <w:t>At tau = 0, define P = 1 without evaluating the quotient. Implement A in log space and use stable expm1-style calculations where available. Constant mode uses P = exp(-r tau) and y_rf = r for all maturities. CIR configuration requires sigma &gt; 0, so the CIR curve never evaluates its singular zero-volatility form.</w:t>
       </w:r>
     </w:p>
     <w:p>
@@ -6907,19 +6749,7 @@
                 <w:rPr>
                   <w:rFonts w:ascii="Cambria Math" w:hAnsi="Cambria Math"/>
                 </w:rPr>
-                <m:t>stoc</m:t>
-              </m:r>
-              <m:r>
-                <w:rPr>
-                  <w:rFonts w:ascii="Cambria Math" w:hAnsi="Cambria Math"/>
-                </w:rPr>
-                <m:t>h</m:t>
-              </m:r>
-              <m:r>
-                <w:rPr>
-                  <w:rFonts w:ascii="Cambria Math" w:hAnsi="Cambria Math"/>
-                </w:rPr>
-                <m:t>astic</m:t>
+                <m:t>stochastic</m:t>
               </m:r>
             </m:sub>
           </m:sSub>
@@ -7032,10 +6862,7 @@
         <w:pStyle w:val="BodyText"/>
       </w:pPr>
       <w:r>
-        <w:t xml:space="preserve">Vintage Story 1.22.7 NatFloat </w:t>
-      </w:r>
-      <w:r>
-        <w:t>Gaussian semantics must be preserved and documented. Its var is a bounded variation parameter, not statistical variance. The verified form is the average of three uniforms:</w:t>
+        <w:t>Vintage Story 1.22.7 NatFloat Gaussian semantics must be preserved and documented. Its var is a bounded variation parameter, not statistical variance. The verified form is the average of three uniforms:</w:t>
       </w:r>
     </w:p>
     <w:p>
@@ -7079,19 +6906,7 @@
             <w:rPr>
               <w:rFonts w:ascii="Cambria Math" w:hAnsi="Cambria Math"/>
             </w:rPr>
-            <m:t>remainin</m:t>
-          </m:r>
-          <m:r>
-            <w:rPr>
-              <w:rFonts w:ascii="Cambria Math" w:hAnsi="Cambria Math"/>
-            </w:rPr>
-            <m:t>gMont</m:t>
-          </m:r>
-          <m:r>
-            <w:rPr>
-              <w:rFonts w:ascii="Cambria Math" w:hAnsi="Cambria Math"/>
-            </w:rPr>
-            <m:t>h</m:t>
+            <m:t>remainingMonth</m:t>
           </m:r>
           <m:sSub>
             <m:sSubPr>
@@ -7348,13 +7163,7 @@
                 <w:rPr>
                   <w:rFonts w:ascii="Cambria Math" w:hAnsi="Cambria Math"/>
                 </w:rPr>
-                <m:t>remainingMont</m:t>
-              </m:r>
-              <m:r>
-                <w:rPr>
-                  <w:rFonts w:ascii="Cambria Math" w:hAnsi="Cambria Math"/>
-                </w:rPr>
-                <m:t>h</m:t>
+                <m:t>remainingMonth</m:t>
               </m:r>
               <m:sSub>
                 <m:sSubPr>
@@ -7420,10 +7229,7 @@
     </w:p>
     <w:p>
       <w:r>
-        <w:t xml:space="preserve">Let D_t </w:t>
-      </w:r>
-      <w:r>
-        <w:t>be total economically accrued rusty savings plus original principal of active rusty CDs. Matured-but-lazily-unsettled proceeds count as savings from their contractual maturity instant. Temporal balances are excluded.</w:t>
+        <w:t>Let D_t be total economically accrued rusty savings plus original principal of active rusty CDs. Matured-but-lazily-unsettled proceeds count as savings from their contractual maturity instant. Temporal balances are excluded.</w:t>
       </w:r>
     </w:p>
     <w:p>
@@ -7680,10 +7486,7 @@
     </w:p>
     <w:p>
       <w:r>
-        <w:t xml:space="preserve">Let configured target funding ratio be u_star, maximum scarcity boost be A_plus, maximum excess-funding reduction be A_minus, response width be w, and adjustment half-life in months be h. Defaults are u_star = 0.25, A_plus = 0.15, A_minus = 0.10, w = 0.10, and </w:t>
-      </w:r>
-      <w:r>
-        <w:t>h = 1.0. The target spread adjustment is:</w:t>
+        <w:t>Let configured target funding ratio be u_star, maximum scarcity boost be A_plus, maximum excess-funding reduction be A_minus, response width be w, and adjustment half-life in months be h. Defaults are u_star = 0.25, A_plus = 0.15, A_minus = 0.10, w = 0.10, and h = 1.0. The target spread adjustment is:</w:t>
       </w:r>
     </w:p>
     <w:p>
@@ -7864,13 +7667,7 @@
             <w:rPr>
               <w:rFonts w:ascii="Cambria Math" w:hAnsi="Cambria Math"/>
             </w:rPr>
-            <m:t> </m:t>
-          </m:r>
-          <m:r>
-            <w:rPr>
-              <w:rFonts w:ascii="Cambria Math" w:hAnsi="Cambria Math"/>
-            </w:rPr>
-            <m:t>u</m:t>
+            <m:t> u</m:t>
           </m:r>
           <m:r>
             <m:rPr>
@@ -8084,13 +7881,7 @@
             <w:rPr>
               <w:rFonts w:ascii="Cambria Math" w:hAnsi="Cambria Math"/>
             </w:rPr>
-            <m:t> </m:t>
-          </m:r>
-          <m:r>
-            <w:rPr>
-              <w:rFonts w:ascii="Cambria Math" w:hAnsi="Cambria Math"/>
-            </w:rPr>
-            <m:t>u</m:t>
+            <m:t> u</m:t>
           </m:r>
           <m:r>
             <m:rPr>
@@ -8316,16 +8107,7 @@
                 <w:rPr>
                   <w:rFonts w:ascii="Cambria Math" w:hAnsi="Cambria Math"/>
                 </w:rPr>
-                <m:t>-</m:t>
-              </m:r>
-              <m:r>
-                <m:rPr>
-                  <m:sty m:val="p"/>
-                </m:rPr>
-                <w:rPr>
-                  <w:rFonts w:ascii="Cambria Math" w:hAnsi="Cambria Math"/>
-                </w:rPr>
-                <m:t>Δ</m:t>
+                <m:t>-Δ</m:t>
               </m:r>
               <m:r>
                 <w:rPr>
@@ -8355,10 +8137,7 @@
     </w:p>
     <w:p>
       <w:r>
-        <w:t>Liquidity checkpoints occur at financial-month boundaries and after committed operations that change aggregate F or D</w:t>
-      </w:r>
-      <w:r>
-        <w:t>, including rusty deposits, withdrawals, CD issue, and CD maturity. At a checkpoint, first decay the observed adjustment to that instant under the previously cached target, then compute u and cache the next target. Between checkpoints, the target is held constant and the observed value is evaluated lazily. A mere quote cannot change the state, preventing quote frequency from affecting prices.</w:t>
+        <w:t>Liquidity checkpoints occur at financial-month boundaries and after committed operations that change aggregate F or D, including rusty deposits, withdrawals, CD issue, and CD maturity. At a checkpoint, first decay the observed adjustment to that instant under the previously cached target, then compute u and cache the next target. Between checkpoints, the target is held constant and the observed value is evaluated lazily. A mere quote cannot change the state, preventing quote frequency from affecting prices.</w:t>
       </w:r>
     </w:p>
     <w:p>
@@ -8374,10 +8153,7 @@
         <w:pStyle w:val="BodyText"/>
       </w:pPr>
       <w:r>
-        <w:t>When financial state is first created, assign the current financial-month serial; draw and persist L and S exactly once for that month; reconstruct F, D, and u; and initialize both observed liquidity adjustment and cached target to a*(u). For a new empty Bank, u = 0, so the initial value is a*(0)</w:t>
-      </w:r>
-      <w:r>
-        <w:t>. Persist initialization before serving any quote. Reload restores it without a redraw, and quotes never mutate L, S, a, or their checkpoints.</w:t>
+        <w:t>When financial state is first created, assign the current financial-month serial; draw and persist L and S exactly once for that month; reconstruct F, D, and u; and initialize both observed liquidity adjustment and cached target to a*(u). For a new empty Bank, u = 0, so the initial value is a*(0). Persist initialization before serving any quote. Reload restores it without a redraw, and quotes never mutate L, S, a, or their checkpoints.</w:t>
       </w:r>
     </w:p>
     <w:p>
@@ -9006,10 +8782,7 @@
     </w:p>
     <w:p>
       <w:r>
-        <w:t xml:space="preserve">M_exact </w:t>
-      </w:r>
-      <w:r>
-        <w:t>is rounded once to six-decimal fixed-point maturity units using ties-to-even. No unapproved yield or principal floor is applied; the exact payoff is disclosed before confirmation.</w:t>
+        <w:t>M_exact is rounded once to six-decimal fixed-point maturity units using ties-to-even. No unapproved yield or principal floor is applied; the exact payoff is disclosed before confirmation.</w:t>
       </w:r>
     </w:p>
     <w:p>
@@ -9017,10 +8790,7 @@
         <w:pStyle w:val="BodyText"/>
       </w:pPr>
       <w:r>
-        <w:t>A server quote is valid for 30 real-time seconds and is bound to one player, principal, tenor, pricing instant, issuance-rule/config revision, active minimum and tenor eligibility, component snapshot, final yield, and rounded maturity value. It has an opaque unique ID and is single-use/replay-safe. A still-unexpired quote remains valid across a financial-month or configuration boundary because its server snapshot is locked; it is not silently repriced or invalidated by a newly raised minimum or removed teno</w:t>
-      </w:r>
-      <w:r>
-        <w:t>r.</w:t>
+        <w:t>A server quote is valid for 30 real-time seconds and is bound to one player, principal, tenor, pricing instant, issuance-rule/config revision, active minimum and tenor eligibility, component snapshot, final yield, and rounded maturity value. It has an opaque unique ID and is single-use/replay-safe. A still-unexpired quote remains valid across a financial-month or configuration boundary because its server snapshot is locked; it is not silently repriced or invalidated by a newly raised minimum or removed tenor.</w:t>
       </w:r>
     </w:p>
     <w:p>
@@ -9083,10 +8853,7 @@
         </w:numPr>
       </w:pPr>
       <w:r>
-        <w:t xml:space="preserve">creates a unique immutable CD record with FinancialIssueInstant = confirmation time and FinancialMaturityInstant = FinancialIssueInstant + T/12 </w:t>
-      </w:r>
-      <w:r>
-        <w:t>financial years;</w:t>
+        <w:t>creates a unique immutable CD record with FinancialIssueInstant = confirmation time and FinancialMaturityInstant = FinancialIssueInstant + T/12 financial years;</w:t>
       </w:r>
     </w:p>
     <w:p>
@@ -9121,10 +8888,7 @@
         <w:pStyle w:val="BodyText"/>
       </w:pPr>
       <w:r>
-        <w:t>The contract stores financial instants, not merely world-calendar dates. Under InGame, live UI may render the world-calendar date currently corresponding to maturity; that rendering is a projection and may change after a backward raw-calendar reanchor without changing the contract. Under ServerRuntime</w:t>
-      </w:r>
-      <w:r>
-        <w:t>, UI and statements label the basis and show remaining financial months or active-runtime-equivalent duration rather than promising an in-world calendar date. A later time-basis switch cannot move the stored maturity instant. Printed statements freeze the basis label and projection shown when printed.</w:t>
+        <w:t>The contract stores financial instants, not merely world-calendar dates. Under InGame, live UI may render the world-calendar date currently corresponding to maturity; that rendering is a projection and may change after a backward raw-calendar reanchor without changing the contract. Under ServerRuntime, UI and statements label the basis and show remaining financial months or active-runtime-equivalent duration rather than promising an in-world calendar date. A later time-basis switch cannot move the stored maturity instant. Printed statements freeze the basis label and projection shown when printed.</w:t>
       </w:r>
     </w:p>
     <w:p>
@@ -9799,10 +9563,7 @@
     </w:p>
     <w:p>
       <w:r>
-        <w:t>The two-sided endpoint clamp supports positive- and negative-yield CDs. It is not a principal floor: when M &lt; P0, informational value may decline below principal. Issue value is exactly P0; maturity value is exactly stored M</w:t>
-      </w:r>
-      <w:r>
-        <w:t>. It is not spendable and creates no interim CD posting.</w:t>
+        <w:t>The two-sided endpoint clamp supports positive- and negative-yield CDs. It is not a principal floor: when M &lt; P0, informational value may decline below principal. Issue value is exactly P0; maturity value is exactly stored M. It is not spendable and creates no interim CD posting.</w:t>
       </w:r>
     </w:p>
     <w:p>
@@ -9827,10 +9588,7 @@
     </w:p>
     <w:p>
       <w:r>
-        <w:t>The maturity journal debits CD principal liability by P, debits CD-interest expense by M - P, credits customer savings liability by credited, and credits the CapOverflow system account by forfeitedAtCap</w:t>
-      </w:r>
-      <w:r>
-        <w:t>, using the debit-positive/credit-negative convention. This exactly balances, extinguishes the contract, and records the finite cutoff amount. It is never retried.</w:t>
+        <w:t>The maturity journal debits CD principal liability by P, debits CD-interest expense by M - P, credits customer savings liability by credited, and credits the CapOverflow system account by forfeitedAtCap, using the debit-positive/credit-negative convention. This exactly balances, extinguishes the contract, and records the finite cutoff amount. It is never retried.</w:t>
       </w:r>
     </w:p>
     <w:p>
@@ -10202,10 +9960,7 @@
         <w:pStyle w:val="BodyText"/>
       </w:pPr>
       <w:r>
-        <w:t>Every branch persists a logical workstation/home anchor and a deterministic safe standing position. For a Charter branch, the mounted Charter is the logical anchor and activation selects a passable interior position associated with it. For a natural branch, the schematic’s hidden anchor and spawn marker provide them. Ordinary idle and wandering targets stay inside the branch’s walkable interior so the Banker remains findable and usable at all hours; Bankers do not adopt arbitrary nearby beds, traders, works</w:t>
-      </w:r>
-      <w:r>
-        <w:t>tations, or player structures.</w:t>
+        <w:t>Every branch persists a logical workstation/home anchor and a deterministic safe standing position. For a Charter branch, the mounted Charter is the logical anchor and activation selects a passable interior position associated with it. For a natural branch, the schematic’s hidden anchor and spawn marker provide them. Ordinary idle and wandering targets stay inside the branch’s walkable interior so the Banker remains findable and usable at all hours; Bankers do not adopt arbitrary nearby beds, traders, workstations, or player structures.</w:t>
       </w:r>
     </w:p>
     <w:p>
@@ -10329,7 +10084,7 @@
         <w:pStyle w:val="BodyText"/>
       </w:pPr>
       <w:r>
-        <w:t>Every irreversible operation has a confirmation step showing server-resolved values. Error messages distinguish insufficient funds, invalid denomination, full inventory, expired quote, unknown recipient, cooldown, and unavailable Banker without leaking internal IDs.</w:t>
+        <w:t>Every irreversible operation has a confirmation step showing server-resolved values. Error messages distinguish insufficient funds, invalid denomination, full inventory, expired quote, unknown recipient, RecipientServiceUnavailable, cooldown, and unavailable Banker without leaking internal IDs.</w:t>
       </w:r>
     </w:p>
     <w:p>
@@ -10633,8 +10388,6 @@
       </w:r>
       <w:r>
         <w:br/>
-      </w:r>
-      <w:r>
         <w:t>dz = candidateZ - existingZ</w:t>
       </w:r>
       <w:r>
@@ -11166,10 +10919,7 @@
     </w:p>
     <w:p>
       <w:r>
-        <w:t xml:space="preserve">A valid Charter branch samples one delay uniformly from the active </w:t>
-      </w:r>
-      <w:r>
-        <w:t>Charter.ArrivalMinimumDays through ArrivalMaximumDays range, default 2 through 5 ordinary in-game days. Persist both the sampled duration and progress; reload or a later config change never rerolls it.</w:t>
+        <w:t>A valid Charter branch samples one delay uniformly from the active Charter.ArrivalMinimumDays through ArrivalMaximumDays range, default 2 through 5 ordinary in-game days. Persist both the sampled duration and progress; reload or a later config change never rerolls it.</w:t>
       </w:r>
     </w:p>
     <w:p>
@@ -11367,10 +11117,7 @@
     </w:p>
     <w:p>
       <w:r>
-        <w:t xml:space="preserve">Explicit death of a Banker assigned to an active branch creates a vacancy and samples uniformly from the active BankerReplacement.MinimumDays through MaximumDays </w:t>
-      </w:r>
-      <w:r>
-        <w:t>range, default 3–7 in-game days. Persisted pending replacement delays never reroll after reload or a later range change.</w:t>
+        <w:t>Explicit death of a Banker assigned to an active branch creates a vacancy and samples uniformly from the active BankerReplacement.MinimumDays through MaximumDays range, default 3–7 in-game days. Persisted pending replacement delays never reroll after reload or a later range change.</w:t>
       </w:r>
     </w:p>
     <w:p>
@@ -12612,13 +12359,7 @@
         <w:pStyle w:val="BodyText"/>
       </w:pPr>
       <w:r>
-        <w:t xml:space="preserve">Economic configuration also receives cross-field validation before activation. For every configured tenor, evaluate the stable CIR/Constant curve, log(T), base spread, bounded level/slope shock extremes, both liquidity-adjustment bounds, and the maturity payoff for the configured minimum principal at r = theta </w:t>
-      </w:r>
-      <w:r>
-        <w:t xml:space="preserve">and the current carried rate. All intermediates must be finite and the minimum-principal payoff must be representable under the balance ceiling. If any derived check fails, reject the economic candidate as a unit and retain the last known-good economic configuration; on first load use the complete documented defaults. Do not silently drop individual tenors. Because CIR rates are mathematically unbounded, each live quote still performs principal/current-rate representability checks and rejects an impossible </w:t>
-      </w:r>
-      <w:r>
-        <w:t>quote without changing state.</w:t>
+        <w:t>Economic configuration also receives cross-field validation before activation. For every configured tenor, evaluate the stable CIR/Constant curve, log(T), base spread, bounded level/slope shock extremes, both liquidity-adjustment bounds, and the maturity payoff for the configured minimum principal at r = theta and the current carried rate. All intermediates must be finite and the minimum-principal payoff must be representable under the balance ceiling. If any derived check fails, reject the economic candidate as a unit and retain the last known-good economic configuration; on first load use the complete documented defaults. Do not silently drop individual tenors. Because CIR rates are mathematically unbounded, each live quote still performs principal/current-rate representability checks and rejects an impossible quote without changing state.</w:t>
       </w:r>
     </w:p>
     <w:p>
@@ -12677,8 +12418,6 @@
       </w:r>
       <w:r>
         <w:br/>
-      </w:r>
-      <w:r>
         <w:t xml:space="preserve">  "TargetAnnualizedRiskFreeRate": 3.0,</w:t>
       </w:r>
       <w:r>
@@ -12764,8 +12503,6 @@
       </w:r>
       <w:r>
         <w:br/>
-      </w:r>
-      <w:r>
         <w:t xml:space="preserve">    "BankLiquidity": {</w:t>
       </w:r>
       <w:r>
@@ -12844,8 +12581,6 @@
       </w:r>
       <w:r>
         <w:br/>
-      </w:r>
-      <w:r>
         <w:t xml:space="preserve">  },</w:t>
       </w:r>
       <w:r>
@@ -13007,7 +12742,7 @@
     </w:p>
     <w:p>
       <w:r>
-        <w:t>Provide a permission-gated command/API accepting current player name, currency, signed fixed-point amount, and mandatory reason. Resolve the player through the current-name registry used for transfers. The server authenticates the administrator; the request cannot choose admin identity.</w:t>
+        <w:t>Provide a permission-gated command/API accepting current player name, currency, signed fixed-point amount, and mandatory reason. Resolve the player through the current-name registry used for transfers. The server authenticates the administrator; the request cannot choose admin identity. While that registry is quarantined, name-based corrections reject with RecipientServiceUnavailable; there is no UID-entry bypass.</w:t>
       </w:r>
     </w:p>
     <w:p>
@@ -13015,10 +12750,7 @@
         <w:pStyle w:val="BodyText"/>
       </w:pPr>
       <w:r>
-        <w:t xml:space="preserve">Before correction, accrue the target at the command timestamp. Reject zero, malformed, overflow/cap-breaking, or balance-negative results. Commit one double-entry AdminCorrection </w:t>
-      </w:r>
-      <w:r>
-        <w:t>against a per-currency system correction account.</w:t>
+        <w:t>Before correction, accrue the target at the command timestamp. Reject zero, malformed, overflow/cap-breaking, or balance-negative results. Commit one double-entry AdminCorrection against a per-currency system correction account.</w:t>
       </w:r>
     </w:p>
     <w:p>
@@ -13205,10 +12937,7 @@
         <w:pStyle w:val="BodyText"/>
       </w:pPr>
       <w:r>
-        <w:t xml:space="preserve">Live history and KnownPlayerListing </w:t>
-      </w:r>
-      <w:r>
-        <w:t>are server-paginated and bounded. Client GUI state is disposable and rebuilt after reconnect. Two players using the same Banker share no account/dialog state.</w:t>
+        <w:t>Live history and KnownPlayerListing are server-paginated and bounded. Client GUI state is disposable and rebuilt after reconnect. Two players using the same Banker share no account/dialog state.</w:t>
       </w:r>
     </w:p>
     <w:p>
@@ -13311,7 +13040,7 @@
         </w:numPr>
       </w:pPr>
       <w:r>
-        <w:t>current-name registry and historical aliases;</w:t>
+        <w:t>recipient-registry epoch/revision, current-name entries and mapping versions, and displaced-name audit history;</w:t>
       </w:r>
     </w:p>
     <w:p>
@@ -13490,7 +13219,24 @@
         </w:numPr>
       </w:pPr>
       <w:r>
-        <w:t>reconciles physical settlements, branches, entities, names, notification outbox, and request indexes before enabling affected mutation or inventory access.</w:t>
+        <w:t>reconciles physical settlements, branches, entities, notification outbox, and request indexes before enabling affected mutation or inventory access; and</w:t>
+      </w:r>
+    </w:p>
+    <w:p>
+      <w:pPr>
+        <w:pStyle w:val="ListParagraph"/>
+        <w:numPr>
+          <w:ilvl w:val="0"/>
+          <w:numId w:val="63"/>
+        </w:numPr>
+      </w:pPr>
+      <w:r>
+        <w:t>validates the persisted recipient registry, then merges only players currently connected and authenticated in this world before enabling name resolution.</w:t>
+      </w:r>
+    </w:p>
+    <w:p>
+      <w:r>
+        <w:t>A fresh First Gear Bank state or a registered migration from a schema that predates the recipient registry creates a new epoch with an empty registry before applying the current-connection merge. In a schema version that requires the registry, a missing epoch, revision, entry version, or otherwise invalid registry is corruption, not permission to recreate or backfill it. Startup must never use saved-player or server-wide membership for name reconciliation. A player who joined and left while First Gear Bank was absent remains excluded; a player authenticated and still connected when the mod starts is observed by the current-connection merge.</w:t>
       </w:r>
     </w:p>
     <w:p>
@@ -13503,10 +13249,7 @@
         <w:pStyle w:val="BodyText"/>
       </w:pPr>
       <w:r>
-        <w:t>Processed-request state survives restart. Retain at least the latest 1,024 full terminal mutation response bodies per player plus every still-relevant quote and settlement detail. Older response bodies may be pruned deterministically. High-water state is retained only for active scopes; exact committed request keys, journal operation IDs, automatic-operation keys, and physical-settlement tombstones remain permanent replay barriers. A closed/pre-restart scope rejects through absence from the active registry,</w:t>
-      </w:r>
-      <w:r>
-        <w:t xml:space="preserve"> and a pruned committed retry rejects as already processed rather than executing again.</w:t>
+        <w:t>Processed-request state survives restart. Retain at least the latest 1,024 full terminal mutation response bodies per player plus every still-relevant quote and settlement detail. Older response bodies may be pruned deterministically. High-water state is retained only for active scopes; exact committed request keys, journal operation IDs, automatic-operation keys, and physical-settlement tombstones remain permanent replay barriers. A closed/pre-restart scope rejects through absence from the active registry, and a pruned committed retry rejects as already processed rather than executing again.</w:t>
       </w:r>
     </w:p>
     <w:p>
@@ -13800,7 +13543,7 @@
           </w:tcPr>
           <w:p>
             <w:r>
-              <w:t>Corrupt authoritative state</w:t>
+              <w:t>Corrupt authoritative financial/journal state</w:t>
             </w:r>
           </w:p>
         </w:tc>
@@ -13890,13 +13633,58 @@
           </w:p>
         </w:tc>
       </w:tr>
+      <w:tr>
+        <w:trPr>
+          <w:cantSplit/>
+        </w:trPr>
+        <w:tc>
+          <w:tcPr>
+            <w:tcW w:w="3960" w:type="dxa"/>
+          </w:tcPr>
+          <w:p>
+            <w:r>
+              <w:t>Recipient-registry corruption</w:t>
+            </w:r>
+          </w:p>
+        </w:tc>
+        <w:tc>
+          <w:tcPr>
+            <w:tcW w:w="3960" w:type="dxa"/>
+          </w:tcPr>
+          <w:p>
+            <w:r>
+              <w:t>Isolate name-resolution services; preserve the registry bytes; never backfill or widen eligibility</w:t>
+            </w:r>
+          </w:p>
+        </w:tc>
+      </w:tr>
     </w:tbl>
     <w:p>
-      <w:pPr>
-        <w:pStyle w:val="Heading2"/>
-      </w:pPr>
       <w:bookmarkStart w:id="68" w:name="privacy-and-trust-boundaries"/>
       <w:bookmarkEnd w:id="67"/>
+      <w:r>
+        <w:t>Recipient-registry quarantine disables exact-name transfer resolution, KnownPlayerListing, transfer confirmation/commit, and name-based administrative corrections. Outstanding recipient tokens reject with the distinct RecipientServiceUnavailable result. Authenticated-UID access to the player’s own deposits, withdrawals, savings, vault, CDs, history, and statements remains available when the journal and those subsystems are healthy.</w:t>
+      </w:r>
+    </w:p>
+    <w:p>
+      <w:r>
+        <w:t>While quarantined, join events cannot produce a successful registry commit and therefore do not make a player eligible; log a bounded diagnostic rather than building a second untrusted name list. Recovery may either restore a separately verified valid registry snapshot or use a permission-gated audited reset with a mandatory reason.</w:t>
+      </w:r>
+    </w:p>
+    <w:p>
+      <w:r>
+        <w:t>A restored snapshot must authenticate as belonging to this exact world and contain a valid RegistryEpochId, registry revision, exactly one current-name entry per UID, each entry's mapping version, and displaced-name audit history. Duplicate canonical names across UIDs are valid and resolve ambiguously. Install it atomically in a zero-journal-record state revision, invalidate all outstanding recipient tokens even if the epoch matches, merge only currently connected authenticated players, and clear quarantine only after validation and persistence. Never supplement it from historical or server-wide membership.</w:t>
+      </w:r>
+    </w:p>
+    <w:p>
+      <w:r>
+        <w:t>Reset preserves the corrupt bytes for export, creates a new RegistryEpochId, zeroes the registry and its revision, invalidates every outstanding recipient token, and commits as a zero-journal-record state revision. It then observes only players currently connected and authenticated. Anyone else must join again. There is no server-wide or historical recovery backfill. Eligibility always means a successful observation commit in the current epoch; after reset, an observation retained only under the old epoch no longer qualifies.</w:t>
+      </w:r>
+    </w:p>
+    <w:p>
+      <w:pPr>
+        <w:pStyle w:val="Heading2"/>
+      </w:pPr>
       <w:r>
         <w:t>Privacy and trust boundaries</w:t>
       </w:r>
@@ -14343,10 +14131,7 @@
         </w:numPr>
       </w:pPr>
       <w:r>
-        <w:t xml:space="preserve">supported world-specific enumeration of previously seen players, explicitly distinguishing world-independent </w:t>
-      </w:r>
-      <w:r>
-        <w:t>IPlayerDataManager data;</w:t>
+        <w:t>authenticated player-join and currently-connected-player hooks needed for the current-epoch, per-world recipient registry, explicitly excluding world-independent IPlayerDataManager data;</w:t>
       </w:r>
     </w:p>
     <w:p>
@@ -14567,10 +14352,7 @@
         </w:numPr>
       </w:pPr>
       <w:r>
-        <w:t xml:space="preserve">InGame </w:t>
-      </w:r>
-      <w:r>
-        <w:t>ordinary progression, sleep, logout, shutdown, forward jumps, and backward reanchor.</w:t>
+        <w:t>InGame ordinary progression, sleep, logout, shutdown, forward jumps, and backward reanchor.</w:t>
       </w:r>
     </w:p>
     <w:p>
@@ -14614,10 +14396,7 @@
         </w:numPr>
       </w:pPr>
       <w:r>
-        <w:t xml:space="preserve">Invalid CIR parameter domains, theta = 0 </w:t>
-      </w:r>
-      <w:r>
-        <w:t>absorbing/point-mass cases, every Constant/CIR model-switch pairing, simultaneous target change, and exactly one-or-zero transition draw as specified.</w:t>
+        <w:t>Invalid CIR parameter domains, theta = 0 absorbing/point-mass cases, every Constant/CIR model-switch pairing, simultaneous target change, and exactly one-or-zero transition draw as specified.</w:t>
       </w:r>
     </w:p>
     <w:p>
@@ -14770,10 +14549,7 @@
         </w:numPr>
       </w:pPr>
       <w:r>
-        <w:t xml:space="preserve">InGame and ServerRuntime </w:t>
-      </w:r>
-      <w:r>
-        <w:t>maturity representations, backward reanchor, and basis switch preserve the contractual financial instant.</w:t>
+        <w:t>InGame and ServerRuntime maturity representations, backward reanchor, and basis switch preserve the contractual financial instant.</w:t>
       </w:r>
     </w:p>
     <w:p>
@@ -14892,7 +14668,29 @@
         </w:numPr>
       </w:pPr>
       <w:r>
-        <w:t>Existing-world saved-player bootstrap (including offline pre-install players), exact-name/listing modes, case-insensitive current names, aliases not resolving, unknown/ambiguous names, rename race, and no UID exposure.</w:t>
+        <w:t>Empty-registry first install/migration; atomic idempotent join/rename registration; persisted epoch/revisions; eligibility only after successful observation commit in the current epoch; authenticated-current-connection startup merge; exclusion of prior-epoch-only and other-world players; eligibility after a prior-epoch visitor rejoins; persistence across restart/upgrade/reinstallation with retained world data; exact-name/listing modes; case-insensitive current names; aliases not resolving; unknown/ambiguous rejection; ambiguous-list omission; rename race; and no UID exposure.</w:t>
+      </w:r>
+    </w:p>
+    <w:p>
+      <w:pPr>
+        <w:numPr>
+          <w:ilvl w:val="0"/>
+          <w:numId w:val="55"/>
+        </w:numPr>
+      </w:pPr>
+      <w:r>
+        <w:t>Unrelated registry updates leave a confirmation valid; selected-recipient rename or a new same-name collision invalidates it.</w:t>
+      </w:r>
+    </w:p>
+    <w:p>
+      <w:pPr>
+        <w:numPr>
+          <w:ilvl w:val="0"/>
+          <w:numId w:val="55"/>
+        </w:numPr>
+      </w:pPr>
+      <w:r>
+        <w:t>Missing/corrupt required registry isolates name services with RecipientServiceUnavailable; authenticated same-world snapshot restoration is atomic and invalidates tokens; audited reset creates a new epoch; neither recovery path backfills, and players joining only during quarantine must rejoin after recovery unless still connected for the recovery merge. Restart/restore retains displaced-name audit history without resolving or listing aliases; a valid restored same-name collision remains ambiguous.</w:t>
       </w:r>
     </w:p>
     <w:p>
@@ -15432,7 +15230,7 @@
         </w:numPr>
       </w:pPr>
       <w:r>
-        <w:t>Implement saved-player name bootstrap, transfers, cooldown, durable notification outbox, and acknowledgment.</w:t>
+        <w:t>Implement the per-world recipient registry and epochs, transfers, cooldown, durable notification outbox, and acknowledgment.</w:t>
       </w:r>
     </w:p>
     <w:p>
@@ -15634,7 +15432,7 @@
         </w:numPr>
       </w:pPr>
       <w:r>
-        <w:t>transfer rusty savings to any previously seen player using current names, including an offline recipient;</w:t>
+        <w:t>transfer rusty savings, using current names, to any offline or online player whose observation First Gear Bank has committed in this world’s current recipient-registry epoch;</w:t>
       </w:r>
     </w:p>
     <w:p>
@@ -15723,8 +15521,6 @@
       </w:r>
       <w:r>
         <w:br/>
-      </w:r>
-      <w:r>
         <w:t>Ledger: append-only, double-entry, signed, schema-versioned</w:t>
       </w:r>
       <w:r>
@@ -15771,8 +15567,6 @@
       </w:r>
       <w:r>
         <w:br/>
-      </w:r>
-      <w:r>
         <w:t>TargetAnnualizedRiskFreeRate: 3.0 effective</w:t>
       </w:r>
       <w:r>
@@ -15815,12 +15609,14 @@
       </w:r>
       <w:r>
         <w:br/>
-        <w:t>Transfers: rusty savings only; current names; known players; offline allowed</w:t>
+        <w:t>Transfers: rusty savings only; current names; successful observation in current epoch</w:t>
       </w:r>
       <w:r>
         <w:br/>
-      </w:r>
-      <w:r>
+        <w:t>Registry: per-world epoch; starts at install; offline allowed; no historical/server-wide backfill</w:t>
+      </w:r>
+      <w:r>
+        <w:br/>
         <w:t>Recipient mode default: ExactName; optional KnownPlayerListing</w:t>
       </w:r>
       <w:r>
@@ -15859,8 +15655,6 @@
       </w:r>
       <w:r>
         <w:br/>
-      </w:r>
-      <w:r>
         <w:t>Statement -&gt; one scrap; both burn at 600C over 5 real seconds</w:t>
       </w:r>
       <w:r>
@@ -15892,8 +15686,6 @@
       </w:r>
       <w:r>
         <w:br/>
-      </w:r>
-      <w:r>
         <w:t>Environment: no immunity, no restoration, no Harmony</w:t>
       </w:r>
       <w:r>
@@ -15925,8 +15717,6 @@
       </w:r>
       <w:r>
         <w:br/>
-      </w:r>
-      <w:r>
         <w:t>BackfillExistingTraderLocations: false by default; visit-driven when enabled</w:t>
       </w:r>
       <w:r>
@@ -16438,6 +16228,92 @@
     </w:lvl>
   </w:abstractNum>
   <w:abstractNum w:abstractNumId="8" w15:restartNumberingAfterBreak="0">
+    <w:nsid w:val="156D29DB"/>
+    <w:multiLevelType w:val="multilevel"/>
+    <w:tmpl w:val="756E70E8"/>
+    <w:lvl w:ilvl="0">
+      <w:start w:val="9"/>
+      <w:numFmt w:val="decimal"/>
+      <w:lvlText w:val="%1."/>
+      <w:lvlJc w:val="left"/>
+      <w:pPr>
+        <w:ind w:left="720" w:hanging="360"/>
+      </w:pPr>
+    </w:lvl>
+    <w:lvl w:ilvl="1">
+      <w:start w:val="1"/>
+      <w:numFmt w:val="decimal"/>
+      <w:lvlText w:val="%2."/>
+      <w:lvlJc w:val="left"/>
+      <w:pPr>
+        <w:ind w:left="1440" w:hanging="360"/>
+      </w:pPr>
+    </w:lvl>
+    <w:lvl w:ilvl="2">
+      <w:start w:val="1"/>
+      <w:numFmt w:val="decimal"/>
+      <w:lvlText w:val="%3."/>
+      <w:lvlJc w:val="left"/>
+      <w:pPr>
+        <w:ind w:left="2160" w:hanging="360"/>
+      </w:pPr>
+    </w:lvl>
+    <w:lvl w:ilvl="3">
+      <w:start w:val="1"/>
+      <w:numFmt w:val="decimal"/>
+      <w:lvlText w:val="%4."/>
+      <w:lvlJc w:val="left"/>
+      <w:pPr>
+        <w:ind w:left="2880" w:hanging="360"/>
+      </w:pPr>
+    </w:lvl>
+    <w:lvl w:ilvl="4">
+      <w:start w:val="1"/>
+      <w:numFmt w:val="decimal"/>
+      <w:lvlText w:val="%5."/>
+      <w:lvlJc w:val="left"/>
+      <w:pPr>
+        <w:ind w:left="3600" w:hanging="360"/>
+      </w:pPr>
+    </w:lvl>
+    <w:lvl w:ilvl="5">
+      <w:start w:val="1"/>
+      <w:numFmt w:val="decimal"/>
+      <w:lvlText w:val="%6."/>
+      <w:lvlJc w:val="left"/>
+      <w:pPr>
+        <w:ind w:left="4320" w:hanging="360"/>
+      </w:pPr>
+    </w:lvl>
+    <w:lvl w:ilvl="6">
+      <w:start w:val="1"/>
+      <w:numFmt w:val="decimal"/>
+      <w:lvlText w:val="%7."/>
+      <w:lvlJc w:val="left"/>
+      <w:pPr>
+        <w:ind w:left="5040" w:hanging="360"/>
+      </w:pPr>
+    </w:lvl>
+    <w:lvl w:ilvl="7">
+      <w:start w:val="1"/>
+      <w:numFmt w:val="decimal"/>
+      <w:lvlText w:val="%8."/>
+      <w:lvlJc w:val="left"/>
+      <w:pPr>
+        <w:ind w:left="5760" w:hanging="360"/>
+      </w:pPr>
+    </w:lvl>
+    <w:lvl w:ilvl="8">
+      <w:start w:val="1"/>
+      <w:numFmt w:val="decimal"/>
+      <w:lvlText w:val="%9."/>
+      <w:lvlJc w:val="left"/>
+      <w:pPr>
+        <w:ind w:left="6480" w:hanging="360"/>
+      </w:pPr>
+    </w:lvl>
+  </w:abstractNum>
+  <w:abstractNum w:abstractNumId="9" w15:restartNumberingAfterBreak="0">
     <w:nsid w:val="4A6B8C2D"/>
     <w:multiLevelType w:val="multilevel"/>
     <w:tmpl w:val="0409001F"/>
@@ -16518,7 +16394,7 @@
     <w:abstractNumId w:val="0"/>
   </w:num>
   <w:num w:numId="7" w16cid:durableId="75789782">
-    <w:abstractNumId w:val="8"/>
+    <w:abstractNumId w:val="9"/>
   </w:num>
   <w:num w:numId="8" w16cid:durableId="183716616">
     <w:abstractNumId w:val="6"/>
@@ -16978,6 +16854,12 @@
     <w:lvlOverride w:ilvl="8">
       <w:startOverride w:val="1"/>
     </w:lvlOverride>
+  </w:num>
+  <w:num w:numId="62" w16cid:durableId="50464625">
+    <w:abstractNumId w:val="7"/>
+  </w:num>
+  <w:num w:numId="63" w16cid:durableId="402721539">
+    <w:abstractNumId w:val="8"/>
   </w:num>
   <w:numIdMacAtCleanup w:val="61"/>
 </w:numbering>

</xml_diff>